<commit_message>
Phụ tùng kho lắp cho xe thuê là xuất bán như dầu (chủ dự án chốt 30/09)
- tinh_toan.la_xuat_ban: xe thuê, dầu (III) hoặc phụ tùng (V) lấy kho → tính theo giá bán cho chủ xe.
- Phiếu: KT Chi phí gõ giá bán dòng phụ tùng kho khi kiểm mục V (cả dòng đã xuất kho); chưa gõ
  thì chặn kiểm (THIEU_GIA_BAN); định khoản dòng 4022/707; ô giá bán + ghi chú trên màn mục V.
- Phải thu cước giữ 1211 như Excel, dầu giữ 625 như anh Khampla (chủ dự án 30/09).
- Tài liệu rà định khoản: quyết định của chủ dự án, giải thích mục mã con, hai lỗ hổng sổ công nợ
  chủ xe ở trang kế toán tạm.

Co-Authored-By: Claude Opus 5.5 (1M context) <noreply@anthropic.com>
</commit_message>
<xml_diff>
--- a/DOCS/word/RA_SOAT_DINH_KHOAN_30_09.docx
+++ b/DOCS/word/RA_SOAT_DINH_KHOAN_30_09.docx
@@ -247,6 +247,52 @@
       </w:pPr>
       <w:r>
         <w:t>chạy thử, chưa ghi; chờ anh cho phép (mục 7).</w:t>
+      </w:r>
+    </w:p>
+    <w:p>
+      <w:pPr>
+        <w:pStyle w:val="ListBullet"/>
+      </w:pPr>
+      <w:r>
+        <w:rPr>
+          <w:b/>
+        </w:rPr>
+        <w:t>Anh đã quyết (30/09 chiều):</w:t>
+      </w:r>
+      <w:r>
+        <w:t xml:space="preserve"> phải thu cước giữ </w:t>
+      </w:r>
+      <w:r>
+        <w:rPr>
+          <w:b/>
+        </w:rPr>
+        <w:t>1211</w:t>
+      </w:r>
+      <w:r>
+        <w:t xml:space="preserve"> như Excel; dầu xe chạy giữ </w:t>
+      </w:r>
+      <w:r>
+        <w:rPr>
+          <w:b/>
+        </w:rPr>
+        <w:t>625</w:t>
+      </w:r>
+      <w:r>
+        <w:t xml:space="preserve"> như anh Khampla;</w:t>
+      </w:r>
+    </w:p>
+    <w:p>
+      <w:pPr>
+        <w:jc w:val="both"/>
+      </w:pPr>
+      <w:r>
+        <w:rPr>
+          <w:b/>
+        </w:rPr>
+        <w:t>phụ tùng kho lắp cho xe thuê là xuất bán như dầu</w:t>
+      </w:r>
+      <w:r>
+        <w:t xml:space="preserve"> (đã làm, mục 3).</w:t>
       </w:r>
     </w:p>
     <w:p>
@@ -687,7 +733,7 @@
           <w:p>
             <w:r/>
             <w:r>
-              <w:t>xe thuê: dầu là xuất BÁN theo giá bán riêng (chốt 29/09). Giá vốn 607/1371 do tờ xuất kho ghi</w:t>
+              <w:t>xe thuê: dầu là xuất BÁN theo giá bán riêng (chốt 29/09)</w:t>
             </w:r>
           </w:p>
         </w:tc>
@@ -1099,7 +1145,10 @@
           <w:p>
             <w:r/>
             <w:r>
-              <w:t>4022/1371</w:t>
+              <w:rPr>
+                <w:b/>
+              </w:rPr>
+              <w:t>4022/707</w:t>
             </w:r>
           </w:p>
         </w:tc>
@@ -1110,7 +1159,7 @@
           <w:p>
             <w:r/>
             <w:r>
-              <w:t>đúng quy trình</w:t>
+              <w:t>xe thuê: phụ tùng cũng là xuất BÁN (anh chốt 30/09). KT Chi phí gõ giá bán khi kiểm mục V; chưa gõ thì không kiểm được. Tiền trả chủ xe trừ theo giá bán</w:t>
             </w:r>
           </w:p>
         </w:tc>
@@ -2178,6 +2227,123 @@
         <w:rPr>
           <w:b/>
         </w:rPr>
+        <w:t>Chưa sửa: hai lỗ hổng ở sổ công nợ chủ xe (trang kế toán tạm).</w:t>
+      </w:r>
+      <w:r>
+        <w:t xml:space="preserve"> Đây là phần tiền của anh Tune, nên cần anh chọn: sửa</w:t>
+      </w:r>
+    </w:p>
+    <w:p>
+      <w:pPr>
+        <w:jc w:val="both"/>
+      </w:pPr>
+      <w:r>
+        <w:t>tạm ở trang kế toán, hay đưa vào hợp đồng API.</w:t>
+      </w:r>
+    </w:p>
+    <w:p>
+      <w:pPr>
+        <w:pStyle w:val="ListNumber"/>
+      </w:pPr>
+      <w:r>
+        <w:rPr>
+          <w:b/>
+        </w:rPr>
+        <w:t>Tiền thuê xe liên kết chưa bao giờ ghi thành nợ.</w:t>
+      </w:r>
+      <w:r>
+        <w:t xml:space="preserve"> Không có bút toán "Nợ chi phí thuê xe / Có 4022". Sổ 4022 chỉ</w:t>
+      </w:r>
+    </w:p>
+    <w:p>
+      <w:pPr>
+        <w:jc w:val="both"/>
+      </w:pPr>
+      <w:r>
+        <w:t xml:space="preserve">có vế Nợ: tiền trả chủ xe, dầu ứng. Trên DB thật, 4022 đang dư Nợ 41.610.300, tức là sổ nói </w:t>
+      </w:r>
+      <w:r>
+        <w:rPr>
+          <w:i/>
+        </w:rPr>
+        <w:t>chủ xe nợ EPL</w:t>
+      </w:r>
+      <w:r>
+        <w:t>, ngược</w:t>
+      </w:r>
+    </w:p>
+    <w:p>
+      <w:pPr>
+        <w:jc w:val="both"/>
+      </w:pPr>
+      <w:r>
+        <w:t xml:space="preserve">với thực tế. Excel của khách có dòng </w:t>
+      </w:r>
+      <w:r>
+        <w:rPr>
+          <w:i/>
+        </w:rPr>
+        <w:t>"ມູນຄ່າ THB 1211/402 ຄ່າຂົນສົ່ງນອກ"</w:t>
+      </w:r>
+      <w:r>
+        <w:t xml:space="preserve"> cho khoản này — cần hỏi anh Khampla ghi thế</w:t>
+      </w:r>
+    </w:p>
+    <w:p>
+      <w:pPr>
+        <w:jc w:val="both"/>
+      </w:pPr>
+      <w:r>
+        <w:t>nào.</w:t>
+      </w:r>
+    </w:p>
+    <w:p>
+      <w:pPr>
+        <w:pStyle w:val="ListNumber"/>
+      </w:pPr>
+      <w:r>
+        <w:rPr>
+          <w:b/>
+        </w:rPr>
+        <w:t>Tờ xuất kho dầu / phụ tùng cho xe thuê</w:t>
+      </w:r>
+      <w:r>
+        <w:t xml:space="preserve"> bên trang kế toán tạm đang ghi Nợ 4022 / Có 1371 </w:t>
+      </w:r>
+      <w:r>
+        <w:rPr>
+          <w:b/>
+        </w:rPr>
+        <w:t>theo giá vốn</w:t>
+      </w:r>
+      <w:r>
+        <w:t>. Đúng</w:t>
+      </w:r>
+    </w:p>
+    <w:p>
+      <w:pPr>
+        <w:jc w:val="both"/>
+      </w:pPr>
+      <w:r>
+        <w:t>ra xuất bán phải tách hai bút toán: Nợ 607 / Có 1371 theo giá vốn, và Nợ 4022 / Có 707 theo giá bán. Trang kế toán</w:t>
+      </w:r>
+    </w:p>
+    <w:p>
+      <w:pPr>
+        <w:jc w:val="both"/>
+      </w:pPr>
+      <w:r>
+        <w:t>tạm không biết giá bán; giá bán nằm trên phiếu bên mình và đã gửi theo dòng.</w:t>
+      </w:r>
+    </w:p>
+    <w:p>
+      <w:pPr>
+        <w:jc w:val="both"/>
+      </w:pPr>
+      <w:r>
+        <w:rPr>
+          <w:b/>
+        </w:rPr>
         <w:t>Chưa sửa, đưa vào hợp đồng API với anh Tune.</w:t>
       </w:r>
       <w:r>
@@ -2225,7 +2391,57 @@
         <w:rPr>
           <w:color w:val="145C4A"/>
         </w:rPr>
-        <w:t>6. Việc cần anh quyết</w:t>
+        <w:t>6. Việc cần anh quyết — cập nhật 30/09 chiều</w:t>
+      </w:r>
+    </w:p>
+    <w:p>
+      <w:pPr>
+        <w:jc w:val="both"/>
+      </w:pPr>
+      <w:r>
+        <w:t>Đã quyết:</w:t>
+      </w:r>
+    </w:p>
+    <w:p>
+      <w:pPr>
+        <w:pStyle w:val="ListBullet"/>
+      </w:pPr>
+      <w:r>
+        <w:t xml:space="preserve">mục 2 và 3 bên dưới: </w:t>
+      </w:r>
+      <w:r>
+        <w:rPr>
+          <w:b/>
+        </w:rPr>
+        <w:t>làm theo Excel và anh Khampla</w:t>
+      </w:r>
+      <w:r>
+        <w:t xml:space="preserve"> (1211, 625), không đổi gì;</w:t>
+      </w:r>
+    </w:p>
+    <w:p>
+      <w:pPr>
+        <w:pStyle w:val="ListBullet"/>
+      </w:pPr>
+      <w:r>
+        <w:t xml:space="preserve">mục 4: </w:t>
+      </w:r>
+      <w:r>
+        <w:rPr>
+          <w:b/>
+        </w:rPr>
+        <w:t>có</w:t>
+      </w:r>
+      <w:r>
+        <w:t>, phụ tùng kho xe thuê là xuất bán — đã làm.</w:t>
+      </w:r>
+    </w:p>
+    <w:p>
+      <w:pPr>
+        <w:jc w:val="both"/>
+      </w:pPr>
+      <w:r>
+        <w:t>Còn mục 1, xem giải thích ngắn ở cuối mục này.</w:t>
       </w:r>
     </w:p>
     <w:p>
@@ -2419,7 +2635,107 @@
         <w:jc w:val="both"/>
       </w:pPr>
       <w:r>
-        <w:t>(4022/707, giá bán riêng) không?</w:t>
+        <w:t xml:space="preserve">(4022/707, giá bán riêng) không? → </w:t>
+      </w:r>
+      <w:r>
+        <w:rPr>
+          <w:b/>
+        </w:rPr>
+        <w:t>Có</w:t>
+      </w:r>
+      <w:r>
+        <w:t xml:space="preserve"> (anh chốt 30/09).</w:t>
+      </w:r>
+    </w:p>
+    <w:p>
+      <w:pPr>
+        <w:jc w:val="both"/>
+      </w:pPr>
+      <w:r>
+        <w:rPr>
+          <w:b/>
+        </w:rPr>
+        <w:t>Mục 1 nói gọn:</w:t>
+      </w:r>
+      <w:r>
+        <w:t xml:space="preserve"> danh mục của anh Tune giống một cái tủ có sẵn 494 ngăn.</w:t>
+      </w:r>
+    </w:p>
+    <w:p>
+      <w:pPr>
+        <w:pStyle w:val="ListBullet"/>
+      </w:pPr>
+      <w:r>
+        <w:t>Anh Khampla chia nhỏ ba ngăn:</w:t>
+      </w:r>
+    </w:p>
+    <w:p>
+      <w:pPr>
+        <w:jc w:val="both"/>
+      </w:pPr>
+      <w:r>
+        <w:t>- ngăn 137 (kho) có thêm ngăn con 1371;</w:t>
+      </w:r>
+    </w:p>
+    <w:p>
+      <w:pPr>
+        <w:jc w:val="both"/>
+      </w:pPr>
+      <w:r>
+        <w:t>- ngăn 402 (nợ phải trả) có thêm hai ngăn con: 4021 cho nhà cung cấp, 4022 cho chủ xe liên kết.</w:t>
+      </w:r>
+    </w:p>
+    <w:p>
+      <w:pPr>
+        <w:pStyle w:val="ListBullet"/>
+      </w:pPr>
+      <w:r>
+        <w:t xml:space="preserve">Tủ bên anh Tune </w:t>
+      </w:r>
+      <w:r>
+        <w:rPr>
+          <w:b/>
+        </w:rPr>
+        <w:t>chưa có ba ngăn con đó</w:t>
+      </w:r>
+      <w:r>
+        <w:t>. Phiếu gửi sang mà ghi 4021 thì sổ bên đó không có chỗ để ghi.</w:t>
+      </w:r>
+    </w:p>
+    <w:p>
+      <w:pPr>
+        <w:pStyle w:val="ListBullet"/>
+      </w:pPr>
+      <w:r>
+        <w:rPr>
+          <w:b/>
+        </w:rPr>
+        <w:t>Cách A (em đề nghị, đúng ý "làm theo anh Khampla"):</w:t>
+      </w:r>
+      <w:r>
+        <w:t xml:space="preserve"> nhắn anh Tune mở thêm ba ngăn con 1371, 4021, 4022. Bên mình</w:t>
+      </w:r>
+    </w:p>
+    <w:p>
+      <w:pPr>
+        <w:jc w:val="both"/>
+      </w:pPr>
+      <w:r>
+        <w:t>không đổi gì.</w:t>
+      </w:r>
+    </w:p>
+    <w:p>
+      <w:pPr>
+        <w:pStyle w:val="ListBullet"/>
+      </w:pPr>
+      <w:r>
+        <w:rPr>
+          <w:b/>
+        </w:rPr>
+        <w:t>Cách B:</w:t>
+      </w:r>
+      <w:r>
+        <w:t xml:space="preserve"> bỏ ngăn con, ghi thẳng vào ngăn lớn (137, 401 / 402). Muốn biết nợ ai thì xem tên đối tượng trên từng dòng.</w:t>
       </w:r>
     </w:p>
     <w:p>

</xml_diff>